<commit_message>
Modificaciones al formulario sesión equipo
</commit_message>
<xml_diff>
--- a/Migracion_CMDBuild_NetBox/Documentación/Propuesta_Migracion_CMDBuild_NetBox_v1.1.docx
+++ b/Migracion_CMDBuild_NetBox/Documentación/Propuesta_Migracion_CMDBuild_NetBox_v1.1.docx
@@ -14612,6 +14612,14 @@
               </w:rPr>
               <w:t xml:space="preserve"> configurado para producción</w:t>
             </w:r>
+            <w:r>
+              <w:rPr>
+                <w:color w:val="000000"/>
+                <w:sz w:val="20"/>
+                <w:szCs w:val="20"/>
+              </w:rPr>
+              <w:t>*</w:t>
+            </w:r>
           </w:p>
         </w:tc>
         <w:tc>
@@ -14685,6 +14693,24 @@
         <w:spacing w:before="80"/>
         <w:jc w:val="both"/>
       </w:pPr>
+    </w:p>
+    <w:p>
+      <w:pPr>
+        <w:spacing w:before="80"/>
+        <w:jc w:val="both"/>
+      </w:pPr>
+      <w:r>
+        <w:t>*</w:t>
+      </w:r>
+      <w:r>
+        <w:t xml:space="preserve"> </w:t>
+      </w:r>
+      <w:r>
+        <w:t>C</w:t>
+      </w:r>
+      <w:r>
+        <w:t>onfigurado para entorno de pruebas, pendiente de adaptar para producción por el equipo de infraestructura.</w:t>
+      </w:r>
     </w:p>
     <w:p>
       <w:pPr>

</xml_diff>